<commit_message>
feat: update production order form templates for finished and semi-finished products
</commit_message>
<xml_diff>
--- a/backend/templates/production-order-template/production-order-finished-product-form-template.docx
+++ b/backend/templates/production-order-template/production-order-finished-product-form-template.docx
@@ -648,7 +648,23 @@
                 <w:b/>
                 <w:bCs/>
               </w:rPr>
-              <w:t>TP Kế hoạch Kho Vận</w:t>
+              <w:t xml:space="preserve">TP Kế </w:t>
+            </w:r>
+            <w:r>
+              <w:rPr>
+                <w:rFonts w:ascii="Times New Roman" w:hAnsi="Times New Roman" w:cs="Times New Roman"/>
+                <w:b/>
+                <w:bCs/>
+              </w:rPr>
+              <w:t>H</w:t>
+            </w:r>
+            <w:r>
+              <w:rPr>
+                <w:rFonts w:ascii="Times New Roman" w:hAnsi="Times New Roman" w:cs="Times New Roman"/>
+                <w:b/>
+                <w:bCs/>
+              </w:rPr>
+              <w:t>oạch Kho Vận</w:t>
             </w:r>
           </w:p>
         </w:tc>
@@ -671,7 +687,55 @@
                 <w:b/>
                 <w:bCs/>
               </w:rPr>
-              <w:t>TP Đảm bảo chất lượng</w:t>
+              <w:t xml:space="preserve">TP Đảm </w:t>
+            </w:r>
+            <w:r>
+              <w:rPr>
+                <w:rFonts w:ascii="Times New Roman" w:hAnsi="Times New Roman" w:cs="Times New Roman"/>
+                <w:b/>
+                <w:bCs/>
+              </w:rPr>
+              <w:t>B</w:t>
+            </w:r>
+            <w:r>
+              <w:rPr>
+                <w:rFonts w:ascii="Times New Roman" w:hAnsi="Times New Roman" w:cs="Times New Roman"/>
+                <w:b/>
+                <w:bCs/>
+              </w:rPr>
+              <w:t xml:space="preserve">ảo </w:t>
+            </w:r>
+            <w:r>
+              <w:rPr>
+                <w:rFonts w:ascii="Times New Roman" w:hAnsi="Times New Roman" w:cs="Times New Roman"/>
+                <w:b/>
+                <w:bCs/>
+              </w:rPr>
+              <w:t>C</w:t>
+            </w:r>
+            <w:r>
+              <w:rPr>
+                <w:rFonts w:ascii="Times New Roman" w:hAnsi="Times New Roman" w:cs="Times New Roman"/>
+                <w:b/>
+                <w:bCs/>
+              </w:rPr>
+              <w:t xml:space="preserve">hất </w:t>
+            </w:r>
+            <w:r>
+              <w:rPr>
+                <w:rFonts w:ascii="Times New Roman" w:hAnsi="Times New Roman" w:cs="Times New Roman"/>
+                <w:b/>
+                <w:bCs/>
+              </w:rPr>
+              <w:t>L</w:t>
+            </w:r>
+            <w:r>
+              <w:rPr>
+                <w:rFonts w:ascii="Times New Roman" w:hAnsi="Times New Roman" w:cs="Times New Roman"/>
+                <w:b/>
+                <w:bCs/>
+              </w:rPr>
+              <w:t>ượng</w:t>
             </w:r>
           </w:p>
         </w:tc>

</xml_diff>

<commit_message>
feat(sensory-checks): implement production order sensory checks API and service
</commit_message>
<xml_diff>
--- a/backend/templates/production-order-template/production-order-finished-product-form-template.docx
+++ b/backend/templates/production-order-template/production-order-finished-product-form-template.docx
@@ -274,7 +274,19 @@
               <w:rPr>
                 <w:rFonts w:ascii="Times New Roman" w:hAnsi="Times New Roman" w:cs="Times New Roman"/>
               </w:rPr>
-              <w:t>Ngày pha chế:</w:t>
+              <w:t>Ngày</w:t>
+            </w:r>
+            <w:r>
+              <w:rPr>
+                <w:rFonts w:ascii="Times New Roman" w:hAnsi="Times New Roman" w:cs="Times New Roman"/>
+              </w:rPr>
+              <w:t xml:space="preserve"> hoàn thiện</w:t>
+            </w:r>
+            <w:r>
+              <w:rPr>
+                <w:rFonts w:ascii="Times New Roman" w:hAnsi="Times New Roman" w:cs="Times New Roman"/>
+              </w:rPr>
+              <w:t>:</w:t>
             </w:r>
           </w:p>
         </w:tc>

</xml_diff>